<commit_message>
fix dates: jour 01 (14 mai), jour 02 (19 mai), jour 03 (20 mai)
</commit_message>
<xml_diff>
--- a/OpenVLA_day03_zivid_api.docx
+++ b/OpenVLA_day03_zivid_api.docx
@@ -272,6 +272,16 @@
       </w:r>
       <w:r>
         <w:t>OpenVLA — Stage CCNB-INNOV</w:t>
+        <w:br/>
+      </w:r>
+      <w:r>
+        <w:rPr>
+          <w:b/>
+        </w:rPr>
+        <w:t xml:space="preserve">Date : </w:t>
+      </w:r>
+      <w:r>
+        <w:t>20 mai 2026</w:t>
         <w:br/>
       </w:r>
       <w:r>

</xml_diff>